<commit_message>
lại upd nhiều vl
</commit_message>
<xml_diff>
--- a/public/assets/magazine/template.docx
+++ b/public/assets/magazine/template.docx
@@ -37,7 +37,6 @@
         </w:rPr>
         <w:t>{</w:t>
       </w:r>
-      <w:proofErr w:type="spellStart"/>
       <w:r>
         <w:rPr>
           <w:rFonts w:ascii="Times" w:hAnsi="Times"/>
@@ -54,7 +53,6 @@
         </w:rPr>
         <w:t>_vi</w:t>
       </w:r>
-      <w:proofErr w:type="spellEnd"/>
       <w:r>
         <w:rPr>
           <w:rFonts w:ascii="Times" w:hAnsi="Times"/>
@@ -699,7 +697,6 @@
         </w:rPr>
         <w:t>{</w:t>
       </w:r>
-      <w:proofErr w:type="spellStart"/>
       <w:r>
         <w:rPr>
           <w:b/>
@@ -710,7 +707,6 @@
         </w:rPr>
         <w:t>title_en</w:t>
       </w:r>
-      <w:proofErr w:type="spellEnd"/>
       <w:r>
         <w:rPr>
           <w:b/>
@@ -737,23 +733,7 @@
           <w:rFonts w:ascii="Times" w:hAnsi="Times"/>
           <w:sz w:val="24"/>
         </w:rPr>
-        <w:t>{</w:t>
-      </w:r>
-      <w:proofErr w:type="spellStart"/>
-      <w:r>
-        <w:rPr>
-          <w:rFonts w:ascii="Times" w:hAnsi="Times"/>
-          <w:sz w:val="24"/>
-        </w:rPr>
-        <w:t>authors_en</w:t>
-      </w:r>
-      <w:proofErr w:type="spellEnd"/>
-      <w:r>
-        <w:rPr>
-          <w:rFonts w:ascii="Times" w:hAnsi="Times"/>
-          <w:sz w:val="24"/>
-        </w:rPr>
-        <w:t>}</w:t>
+        <w:t>{authors_en}</w:t>
       </w:r>
     </w:p>
     <w:p>
@@ -976,27 +956,7 @@
                 <w:szCs w:val="20"/>
                 <w:lang w:val="en-US"/>
               </w:rPr>
-              <w:t>{</w:t>
-            </w:r>
-            <w:proofErr w:type="spellStart"/>
-            <w:r>
-              <w:rPr>
-                <w:rFonts w:ascii="Times New Roman" w:hAnsi="Times New Roman"/>
-                <w:sz w:val="20"/>
-                <w:szCs w:val="20"/>
-                <w:lang w:val="en-US"/>
-              </w:rPr>
-              <w:t>abstract_en</w:t>
-            </w:r>
-            <w:proofErr w:type="spellEnd"/>
-            <w:r>
-              <w:rPr>
-                <w:rFonts w:ascii="Times New Roman" w:hAnsi="Times New Roman"/>
-                <w:sz w:val="20"/>
-                <w:szCs w:val="20"/>
-                <w:lang w:val="en-US"/>
-              </w:rPr>
-              <w:t>}</w:t>
+              <w:t>{abstract_en}</w:t>
             </w:r>
           </w:p>
         </w:tc>
@@ -1282,17 +1242,7 @@
                 <w:szCs w:val="20"/>
                 <w:lang w:val="en-US"/>
               </w:rPr>
-              <w:t>{</w:t>
-            </w:r>
-            <w:proofErr w:type="spellStart"/>
-            <w:r>
-              <w:rPr>
-                <w:rFonts w:ascii="Times New Roman" w:hAnsi="Times New Roman"/>
-                <w:sz w:val="20"/>
-                <w:szCs w:val="20"/>
-                <w:lang w:val="en-US"/>
-              </w:rPr>
-              <w:t>keywords</w:t>
+              <w:t>{keywords</w:t>
             </w:r>
             <w:r>
               <w:rPr>
@@ -1303,7 +1253,6 @@
               </w:rPr>
               <w:t>_en</w:t>
             </w:r>
-            <w:proofErr w:type="spellEnd"/>
             <w:r>
               <w:rPr>
                 <w:rFonts w:ascii="Times New Roman" w:hAnsi="Times New Roman"/>
@@ -4638,15 +4587,6 @@
             </w:rPr>
             <w:t>JOURNAL OF SCIENCE</w:t>
           </w:r>
-          <w:r>
-            <w:rPr>
-              <w:rFonts w:ascii="Cambria" w:eastAsia="Times New Roman" w:hAnsi="Cambria"/>
-              <w:color w:val="1F4E79"/>
-              <w:sz w:val="32"/>
-              <w:szCs w:val="28"/>
-            </w:rPr>
-            <w:t>Z</w:t>
-          </w:r>
         </w:p>
         <w:p>
           <w:pPr>
@@ -4721,77 +4661,13 @@
             </w:rPr>
             <w:br/>
           </w:r>
-          <w:proofErr w:type="spellStart"/>
           <w:r>
             <w:rPr>
               <w:rFonts w:ascii="Times New Roman" w:hAnsi="Times New Roman"/>
               <w:color w:val="1F4E79"/>
               <w:lang w:val="en-US"/>
             </w:rPr>
-            <w:t>Tạp</w:t>
-          </w:r>
-          <w:proofErr w:type="spellEnd"/>
-          <w:r>
-            <w:rPr>
-              <w:rFonts w:ascii="Times New Roman" w:hAnsi="Times New Roman"/>
-              <w:color w:val="1F4E79"/>
-              <w:lang w:val="en-US"/>
-            </w:rPr>
-            <w:t xml:space="preserve"> </w:t>
-          </w:r>
-          <w:proofErr w:type="spellStart"/>
-          <w:r>
-            <w:rPr>
-              <w:rFonts w:ascii="Times New Roman" w:hAnsi="Times New Roman"/>
-              <w:color w:val="1F4E79"/>
-              <w:lang w:val="en-US"/>
-            </w:rPr>
-            <w:t>chí</w:t>
-          </w:r>
-          <w:proofErr w:type="spellEnd"/>
-          <w:r>
-            <w:rPr>
-              <w:rFonts w:ascii="Times New Roman" w:hAnsi="Times New Roman"/>
-              <w:color w:val="1F4E79"/>
-              <w:lang w:val="en-US"/>
-            </w:rPr>
-            <w:t xml:space="preserve"> Khoa </w:t>
-          </w:r>
-          <w:proofErr w:type="spellStart"/>
-          <w:r>
-            <w:rPr>
-              <w:rFonts w:ascii="Times New Roman" w:hAnsi="Times New Roman"/>
-              <w:color w:val="1F4E79"/>
-              <w:lang w:val="en-US"/>
-            </w:rPr>
-            <w:t>học</w:t>
-          </w:r>
-          <w:proofErr w:type="spellEnd"/>
-          <w:r>
-            <w:rPr>
-              <w:rFonts w:ascii="Times New Roman" w:hAnsi="Times New Roman"/>
-              <w:color w:val="1F4E79"/>
-              <w:lang w:val="en-US"/>
-            </w:rPr>
-            <w:t xml:space="preserve"> </w:t>
-          </w:r>
-          <w:proofErr w:type="spellStart"/>
-          <w:r>
-            <w:rPr>
-              <w:rFonts w:ascii="Times New Roman" w:hAnsi="Times New Roman"/>
-              <w:color w:val="1F4E79"/>
-              <w:lang w:val="en-US"/>
-            </w:rPr>
-            <w:t>Lạc</w:t>
-          </w:r>
-          <w:proofErr w:type="spellEnd"/>
-          <w:r>
-            <w:rPr>
-              <w:rFonts w:ascii="Times New Roman" w:hAnsi="Times New Roman"/>
-              <w:color w:val="1F4E79"/>
-              <w:lang w:val="en-US"/>
-            </w:rPr>
-            <w:t xml:space="preserve"> Hồng</w:t>
+            <w:t>Tạp chí Khoa học Lạc Hồng</w:t>
           </w:r>
           <w:r>
             <w:rPr>

</xml_diff>

<commit_message>
- Trong nội dung với các chỗ được định dạng heading 1, 2, 3 thì khi xuất có cái bị nghiêng cái không, sửa lại là khi xuất đều thẳng bình thường hết nha - Phần keywords trên preview thì đã có tự tách xuống dòng đối với mỗi từ ngăn cách bằng ; hay , nhưng mà khi xuất file thì nó vẫn liên tiếp á - ở trong template tại trang metadata có 2 key mình vừa thêm là {doi} và {link_doi} thì mình muốn có thêm 2 trường để điền thông tin cho chúng để xuất cũng truyền vào cho nó, đồng thời trên preview cũng có hiện 2 dòng đó luôn. Đây là ... file template nè và hình ảnh để biết 2 dòng đó như thế nào trong template (ảnh đính kèm)
</commit_message>
<xml_diff>
--- a/public/assets/magazine/template.docx
+++ b/public/assets/magazine/template.docx
@@ -1329,6 +1329,16 @@
               </w:rPr>
               <w:t>Doi:</w:t>
             </w:r>
+            <w:r>
+              <w:rPr>
+                <w:rFonts w:ascii="Times New Roman" w:eastAsia="Times New Roman" w:hAnsi="Times New Roman"/>
+                <w:color w:val="000000"/>
+                <w:sz w:val="20"/>
+                <w:szCs w:val="20"/>
+                <w:lang w:val="en-US"/>
+              </w:rPr>
+              <w:t xml:space="preserve"> {doi}</w:t>
+            </w:r>
           </w:p>
           <w:p>
             <w:pPr>
@@ -1367,18 +1377,9 @@
               </w:rPr>
               <w:t xml:space="preserve"> </w:t>
             </w:r>
-            <w:hyperlink r:id="rId9" w:history="1">
-              <w:r>
-                <w:rPr>
-                  <w:rStyle w:val="Hyperlink"/>
-                  <w:rFonts w:ascii="Times New Roman" w:eastAsia="Times New Roman" w:hAnsi="Times New Roman"/>
-                  <w:sz w:val="20"/>
-                  <w:szCs w:val="20"/>
-                  <w:lang w:val="en-US"/>
-                </w:rPr>
-                <w:t>https://js.lhu.edu.vn/index.php/lachong</w:t>
-              </w:r>
-            </w:hyperlink>
+            <w:r>
+              <w:t>{link_doi}</w:t>
+            </w:r>
           </w:p>
         </w:tc>
       </w:tr>
@@ -1391,12 +1392,12 @@
           <w:szCs w:val="20"/>
         </w:rPr>
         <w:sectPr>
-          <w:headerReference w:type="even" r:id="rId10"/>
-          <w:headerReference w:type="default" r:id="rId11"/>
-          <w:footerReference w:type="even" r:id="rId12"/>
-          <w:footerReference w:type="default" r:id="rId13"/>
-          <w:headerReference w:type="first" r:id="rId14"/>
-          <w:footerReference w:type="first" r:id="rId15"/>
+          <w:headerReference w:type="even" r:id="rId9"/>
+          <w:headerReference w:type="default" r:id="rId10"/>
+          <w:footerReference w:type="even" r:id="rId11"/>
+          <w:footerReference w:type="default" r:id="rId12"/>
+          <w:headerReference w:type="first" r:id="rId13"/>
+          <w:footerReference w:type="first" r:id="rId14"/>
           <w:type w:val="continuous"/>
           <w:pgSz w:w="11909" w:h="16834" w:code="9"/>
           <w:pgMar w:top="851" w:right="567" w:bottom="851" w:left="1418" w:header="720" w:footer="720" w:gutter="0"/>
@@ -1425,8 +1426,8 @@
           <w:szCs w:val="20"/>
         </w:rPr>
         <w:sectPr>
-          <w:footerReference w:type="default" r:id="rId16"/>
-          <w:headerReference w:type="first" r:id="rId17"/>
+          <w:footerReference w:type="default" r:id="rId15"/>
+          <w:headerReference w:type="first" r:id="rId16"/>
           <w:type w:val="continuous"/>
           <w:pgSz w:w="11909" w:h="16834" w:code="9"/>
           <w:pgMar w:top="851" w:right="567" w:bottom="851" w:left="1418" w:header="720" w:footer="720" w:gutter="0"/>
@@ -1480,10 +1481,10 @@
           <w:lang w:val="en-US"/>
         </w:rPr>
         <w:sectPr>
-          <w:headerReference w:type="even" r:id="rId18"/>
-          <w:headerReference w:type="default" r:id="rId19"/>
-          <w:footerReference w:type="even" r:id="rId20"/>
-          <w:footerReference w:type="default" r:id="rId21"/>
+          <w:headerReference w:type="even" r:id="rId17"/>
+          <w:headerReference w:type="default" r:id="rId18"/>
+          <w:footerReference w:type="even" r:id="rId19"/>
+          <w:footerReference w:type="default" r:id="rId20"/>
           <w:type w:val="continuous"/>
           <w:pgSz w:w="11909" w:h="16834" w:code="9"/>
           <w:pgMar w:top="851" w:right="567" w:bottom="851" w:left="1418" w:header="720" w:footer="720" w:gutter="0"/>
@@ -1508,7 +1509,7 @@
       </w:r>
     </w:p>
     <w:sectPr>
-      <w:footerReference w:type="default" r:id="rId22"/>
+      <w:footerReference w:type="default" r:id="rId21"/>
       <w:type w:val="continuous"/>
       <w:pgSz w:w="11909" w:h="16834" w:code="9"/>
       <w:pgMar w:top="851" w:right="567" w:bottom="851" w:left="1418" w:header="720" w:footer="720" w:gutter="0"/>

</xml_diff>

<commit_message>
header năm, số báo, footer số báo năm
</commit_message>
<xml_diff>
--- a/public/assets/magazine/template.docx
+++ b/public/assets/magazine/template.docx
@@ -4665,66 +4665,13 @@
           <w:r>
             <w:rPr>
               <w:rFonts w:ascii="Times New Roman" w:hAnsi="Times New Roman"/>
+              <w:b/>
               <w:color w:val="1F4E79"/>
+              <w:sz w:val="16"/>
+              <w:szCs w:val="16"/>
               <w:lang w:val="en-US"/>
             </w:rPr>
-            <w:t>Tạp chí Khoa học Lạc Hồng</w:t>
-          </w:r>
-          <w:r>
-            <w:rPr>
-              <w:rFonts w:ascii="Times New Roman" w:hAnsi="Times New Roman"/>
-              <w:color w:val="1F4E79"/>
-              <w:lang w:val="en-US"/>
-            </w:rPr>
-            <w:t>,</w:t>
-          </w:r>
-          <w:r>
-            <w:rPr>
-              <w:rFonts w:ascii="Times New Roman" w:hAnsi="Times New Roman"/>
-              <w:color w:val="1F4E79"/>
-              <w:lang w:val="en-US"/>
-            </w:rPr>
-            <w:t xml:space="preserve"> </w:t>
-          </w:r>
-          <w:r>
-            <w:rPr>
-              <w:rFonts w:ascii="Times New Roman" w:hAnsi="Times New Roman"/>
-              <w:color w:val="1F4E79"/>
-              <w:lang w:val="en-US"/>
-            </w:rPr>
-            <w:t>2025</w:t>
-          </w:r>
-          <w:r>
-            <w:rPr>
-              <w:rFonts w:ascii="Times New Roman" w:hAnsi="Times New Roman"/>
-              <w:color w:val="1F4E79"/>
-              <w:lang w:val="en-US"/>
-            </w:rPr>
-            <w:t xml:space="preserve">, </w:t>
-          </w:r>
-          <w:r>
-            <w:rPr>
-              <w:rFonts w:ascii="Times New Roman" w:hAnsi="Times New Roman"/>
-              <w:color w:val="1F4E79"/>
-              <w:lang w:val="en-US"/>
-            </w:rPr>
-            <w:t>20</w:t>
-          </w:r>
-          <w:r>
-            <w:rPr>
-              <w:rFonts w:ascii="Times New Roman" w:hAnsi="Times New Roman"/>
-              <w:color w:val="1F4E79"/>
-              <w:lang w:val="en-US"/>
-            </w:rPr>
-            <w:t>, 001-00</w:t>
-          </w:r>
-          <w:r>
-            <w:rPr>
-              <w:rFonts w:ascii="Times New Roman" w:hAnsi="Times New Roman"/>
-              <w:color w:val="1F4E79"/>
-              <w:lang w:val="en-US"/>
-            </w:rPr>
-            <w:t>5</w:t>
+            <w:t>{journal_meta}</w:t>
           </w:r>
         </w:p>
       </w:tc>

</xml_diff>

<commit_message>
header năm, số báo, footer số báo năm v2
</commit_message>
<xml_diff>
--- a/public/assets/magazine/template.docx
+++ b/public/assets/magazine/template.docx
@@ -37,6 +37,7 @@
         </w:rPr>
         <w:t>{</w:t>
       </w:r>
+      <w:proofErr w:type="spellStart"/>
       <w:r>
         <w:rPr>
           <w:rFonts w:ascii="Times" w:hAnsi="Times"/>
@@ -53,6 +54,7 @@
         </w:rPr>
         <w:t>_vi</w:t>
       </w:r>
+      <w:proofErr w:type="spellEnd"/>
       <w:r>
         <w:rPr>
           <w:rFonts w:ascii="Times" w:hAnsi="Times"/>
@@ -697,6 +699,7 @@
         </w:rPr>
         <w:t>{</w:t>
       </w:r>
+      <w:proofErr w:type="spellStart"/>
       <w:r>
         <w:rPr>
           <w:b/>
@@ -707,6 +710,7 @@
         </w:rPr>
         <w:t>title_en</w:t>
       </w:r>
+      <w:proofErr w:type="spellEnd"/>
       <w:r>
         <w:rPr>
           <w:b/>
@@ -733,7 +737,23 @@
           <w:rFonts w:ascii="Times" w:hAnsi="Times"/>
           <w:sz w:val="24"/>
         </w:rPr>
-        <w:t>{authors_en}</w:t>
+        <w:t>{</w:t>
+      </w:r>
+      <w:proofErr w:type="spellStart"/>
+      <w:r>
+        <w:rPr>
+          <w:rFonts w:ascii="Times" w:hAnsi="Times"/>
+          <w:sz w:val="24"/>
+        </w:rPr>
+        <w:t>authors_en</w:t>
+      </w:r>
+      <w:proofErr w:type="spellEnd"/>
+      <w:r>
+        <w:rPr>
+          <w:rFonts w:ascii="Times" w:hAnsi="Times"/>
+          <w:sz w:val="24"/>
+        </w:rPr>
+        <w:t>}</w:t>
       </w:r>
     </w:p>
     <w:p>
@@ -956,7 +976,27 @@
                 <w:szCs w:val="20"/>
                 <w:lang w:val="en-US"/>
               </w:rPr>
-              <w:t>{abstract_en}</w:t>
+              <w:t>{</w:t>
+            </w:r>
+            <w:proofErr w:type="spellStart"/>
+            <w:r>
+              <w:rPr>
+                <w:rFonts w:ascii="Times New Roman" w:hAnsi="Times New Roman"/>
+                <w:sz w:val="20"/>
+                <w:szCs w:val="20"/>
+                <w:lang w:val="en-US"/>
+              </w:rPr>
+              <w:t>abstract_en</w:t>
+            </w:r>
+            <w:proofErr w:type="spellEnd"/>
+            <w:r>
+              <w:rPr>
+                <w:rFonts w:ascii="Times New Roman" w:hAnsi="Times New Roman"/>
+                <w:sz w:val="20"/>
+                <w:szCs w:val="20"/>
+                <w:lang w:val="en-US"/>
+              </w:rPr>
+              <w:t>}</w:t>
             </w:r>
           </w:p>
         </w:tc>
@@ -1242,7 +1282,17 @@
                 <w:szCs w:val="20"/>
                 <w:lang w:val="en-US"/>
               </w:rPr>
-              <w:t>{keywords</w:t>
+              <w:t>{</w:t>
+            </w:r>
+            <w:proofErr w:type="spellStart"/>
+            <w:r>
+              <w:rPr>
+                <w:rFonts w:ascii="Times New Roman" w:hAnsi="Times New Roman"/>
+                <w:sz w:val="20"/>
+                <w:szCs w:val="20"/>
+                <w:lang w:val="en-US"/>
+              </w:rPr>
+              <w:t>keywords</w:t>
             </w:r>
             <w:r>
               <w:rPr>
@@ -1253,6 +1303,7 @@
               </w:rPr>
               <w:t>_en</w:t>
             </w:r>
+            <w:proofErr w:type="spellEnd"/>
             <w:r>
               <w:rPr>
                 <w:rFonts w:ascii="Times New Roman" w:hAnsi="Times New Roman"/>
@@ -1337,7 +1388,29 @@
                 <w:szCs w:val="20"/>
                 <w:lang w:val="en-US"/>
               </w:rPr>
-              <w:t xml:space="preserve"> {doi}</w:t>
+              <w:t xml:space="preserve"> {</w:t>
+            </w:r>
+            <w:proofErr w:type="spellStart"/>
+            <w:r>
+              <w:rPr>
+                <w:rFonts w:ascii="Times New Roman" w:eastAsia="Times New Roman" w:hAnsi="Times New Roman"/>
+                <w:color w:val="000000"/>
+                <w:sz w:val="20"/>
+                <w:szCs w:val="20"/>
+                <w:lang w:val="en-US"/>
+              </w:rPr>
+              <w:t>doi</w:t>
+            </w:r>
+            <w:proofErr w:type="spellEnd"/>
+            <w:r>
+              <w:rPr>
+                <w:rFonts w:ascii="Times New Roman" w:eastAsia="Times New Roman" w:hAnsi="Times New Roman"/>
+                <w:color w:val="000000"/>
+                <w:sz w:val="20"/>
+                <w:szCs w:val="20"/>
+                <w:lang w:val="en-US"/>
+              </w:rPr>
+              <w:t>}</w:t>
             </w:r>
           </w:p>
           <w:p>
@@ -1378,7 +1451,15 @@
               <w:t xml:space="preserve"> </w:t>
             </w:r>
             <w:r>
-              <w:t>{link_doi}</w:t>
+              <w:t>{</w:t>
+            </w:r>
+            <w:proofErr w:type="spellStart"/>
+            <w:r>
+              <w:t>link_doi</w:t>
+            </w:r>
+            <w:proofErr w:type="spellEnd"/>
+            <w:r>
+              <w:t>}</w:t>
             </w:r>
           </w:p>
         </w:tc>
@@ -4636,7 +4717,6 @@
               <w:rFonts w:ascii="Times New Roman" w:hAnsi="Times New Roman"/>
               <w:b/>
               <w:color w:val="1F4E79"/>
-              <w:sz w:val="16"/>
               <w:szCs w:val="16"/>
               <w:lang w:val="en-US"/>
             </w:rPr>
@@ -4649,23 +4729,46 @@
               <w:szCs w:val="16"/>
               <w:lang w:val="en-US"/>
             </w:rPr>
-            <w:t>ISSN: 2525 - 2186</w:t>
+            <w:t xml:space="preserve">ISSN: 2525 </w:t>
           </w:r>
           <w:r>
             <w:rPr>
               <w:rFonts w:ascii="Times New Roman" w:hAnsi="Times New Roman"/>
               <w:b/>
               <w:color w:val="1F4E79"/>
-              <w:sz w:val="16"/>
               <w:szCs w:val="16"/>
               <w:lang w:val="en-US"/>
             </w:rPr>
-            <w:br/>
+            <w:t>–</w:t>
           </w:r>
           <w:r>
             <w:rPr>
               <w:rFonts w:ascii="Times New Roman" w:hAnsi="Times New Roman"/>
               <w:b/>
+              <w:color w:val="1F4E79"/>
+              <w:szCs w:val="16"/>
+              <w:lang w:val="en-US"/>
+            </w:rPr>
+            <w:t xml:space="preserve"> 2186</w:t>
+          </w:r>
+        </w:p>
+        <w:p>
+          <w:pPr>
+            <w:pStyle w:val="Footer"/>
+            <w:jc w:val="right"/>
+            <w:rPr>
+              <w:rFonts w:ascii="Times New Roman" w:hAnsi="Times New Roman"/>
+              <w:b/>
+              <w:color w:val="1F4E79"/>
+              <w:szCs w:val="16"/>
+              <w:lang w:val="en-US"/>
+            </w:rPr>
+          </w:pPr>
+          <w:r>
+            <w:rPr>
+              <w:rFonts w:ascii="Times New Roman" w:hAnsi="Times New Roman"/>
+              <w:b/>
+              <w:noProof/>
               <w:color w:val="1F4E79"/>
               <w:sz w:val="16"/>
               <w:szCs w:val="16"/>

</xml_diff>

<commit_message>
header năm, số báo, footer số báo năm v5
</commit_message>
<xml_diff>
--- a/public/assets/magazine/template.docx
+++ b/public/assets/magazine/template.docx
@@ -41,7 +41,6 @@
       <w:r>
         <w:rPr>
           <w:rFonts w:ascii="Times" w:hAnsi="Times"/>
-          <w:noProof/>
           <w:sz w:val="24"/>
         </w:rPr>
         <w:t>authors</w:t>
@@ -49,7 +48,6 @@
       <w:r>
         <w:rPr>
           <w:rFonts w:ascii="Times" w:hAnsi="Times"/>
-          <w:noProof/>
           <w:sz w:val="24"/>
         </w:rPr>
         <w:t>_vi</w:t>
@@ -745,7 +743,14 @@
           <w:rFonts w:ascii="Times" w:hAnsi="Times"/>
           <w:sz w:val="24"/>
         </w:rPr>
-        <w:t>authors_en</w:t>
+        <w:t>authors_</w:t>
+      </w:r>
+      <w:r>
+        <w:rPr>
+          <w:rFonts w:ascii="Times" w:hAnsi="Times"/>
+          <w:sz w:val="24"/>
+        </w:rPr>
+        <w:t>en</w:t>
       </w:r>
       <w:proofErr w:type="spellEnd"/>
       <w:r>
@@ -1578,12 +1583,20 @@
     <w:p>
       <w:pPr>
         <w:spacing w:after="0" w:line="240" w:lineRule="auto"/>
+        <w:rPr>
+          <w:rFonts w:ascii="Times New Roman" w:eastAsia="Times New Roman" w:hAnsi="Times New Roman"/>
+          <w:b/>
+          <w:bCs/>
+          <w:i/>
+          <w:sz w:val="20"/>
+          <w:szCs w:val="20"/>
+          <w:lang w:val="vi-VN"/>
+        </w:rPr>
       </w:pPr>
       <w:r>
         <w:rPr>
           <w:sz w:val="20"/>
           <w:szCs w:val="20"/>
-          <w:lang w:val="en-US"/>
         </w:rPr>
         <w:lastRenderedPageBreak/>
         <w:t>{content}</w:t>
@@ -2530,7 +2543,7 @@
       <mc:AlternateContent>
         <mc:Choice Requires="wpg">
           <w:drawing>
-            <wp:anchor distT="0" distB="0" distL="0" distR="0" simplePos="0" relativeHeight="251652608" behindDoc="0" locked="0" layoutInCell="1" allowOverlap="1" wp14:anchorId="34DD433E" wp14:editId="306F0EC0">
+            <wp:anchor distT="0" distB="0" distL="0" distR="0" simplePos="0" relativeHeight="251652608" behindDoc="0" locked="0" layoutInCell="1" allowOverlap="1" wp14:anchorId="34DD433E" wp14:editId="6795028F">
               <wp:simplePos x="0" y="0"/>
               <wp:positionH relativeFrom="page">
                 <wp:posOffset>900430</wp:posOffset>
@@ -2713,7 +2726,7 @@
       <mc:AlternateContent>
         <mc:Choice Requires="wps">
           <w:drawing>
-            <wp:anchor distT="0" distB="0" distL="0" distR="0" simplePos="0" relativeHeight="251651584" behindDoc="0" locked="0" layoutInCell="1" allowOverlap="1" wp14:anchorId="1E486619" wp14:editId="45B4484A">
+            <wp:anchor distT="0" distB="0" distL="0" distR="0" simplePos="0" relativeHeight="251651584" behindDoc="0" locked="0" layoutInCell="1" allowOverlap="1" wp14:anchorId="1E486619" wp14:editId="744B082A">
               <wp:simplePos x="0" y="0"/>
               <wp:positionH relativeFrom="page">
                 <wp:posOffset>7202170</wp:posOffset>
@@ -4717,6 +4730,7 @@
               <w:rFonts w:ascii="Times New Roman" w:hAnsi="Times New Roman"/>
               <w:b/>
               <w:color w:val="1F4E79"/>
+              <w:sz w:val="16"/>
               <w:szCs w:val="16"/>
               <w:lang w:val="en-US"/>
             </w:rPr>
@@ -4729,52 +4743,132 @@
               <w:szCs w:val="16"/>
               <w:lang w:val="en-US"/>
             </w:rPr>
-            <w:t xml:space="preserve">ISSN: 2525 </w:t>
+            <w:t>ISSN: 2525 - 2186</w:t>
           </w:r>
           <w:r>
             <w:rPr>
               <w:rFonts w:ascii="Times New Roman" w:hAnsi="Times New Roman"/>
               <w:b/>
               <w:color w:val="1F4E79"/>
+              <w:sz w:val="16"/>
               <w:szCs w:val="16"/>
               <w:lang w:val="en-US"/>
             </w:rPr>
-            <w:t>–</w:t>
+            <w:br/>
+          </w:r>
+          <w:proofErr w:type="spellStart"/>
+          <w:r>
+            <w:rPr>
+              <w:rFonts w:ascii="Times New Roman" w:hAnsi="Times New Roman"/>
+              <w:color w:val="1F4E79"/>
+              <w:lang w:val="en-US"/>
+            </w:rPr>
+            <w:t>Tạp</w:t>
+          </w:r>
+          <w:proofErr w:type="spellEnd"/>
+          <w:r>
+            <w:rPr>
+              <w:rFonts w:ascii="Times New Roman" w:hAnsi="Times New Roman"/>
+              <w:color w:val="1F4E79"/>
+              <w:lang w:val="en-US"/>
+            </w:rPr>
+            <w:t xml:space="preserve"> </w:t>
+          </w:r>
+          <w:proofErr w:type="spellStart"/>
+          <w:r>
+            <w:rPr>
+              <w:rFonts w:ascii="Times New Roman" w:hAnsi="Times New Roman"/>
+              <w:color w:val="1F4E79"/>
+              <w:lang w:val="en-US"/>
+            </w:rPr>
+            <w:t>chí</w:t>
+          </w:r>
+          <w:proofErr w:type="spellEnd"/>
+          <w:r>
+            <w:rPr>
+              <w:rFonts w:ascii="Times New Roman" w:hAnsi="Times New Roman"/>
+              <w:color w:val="1F4E79"/>
+              <w:lang w:val="en-US"/>
+            </w:rPr>
+            <w:t xml:space="preserve"> Khoa </w:t>
+          </w:r>
+          <w:proofErr w:type="spellStart"/>
+          <w:r>
+            <w:rPr>
+              <w:rFonts w:ascii="Times New Roman" w:hAnsi="Times New Roman"/>
+              <w:color w:val="1F4E79"/>
+              <w:lang w:val="en-US"/>
+            </w:rPr>
+            <w:t>học</w:t>
+          </w:r>
+          <w:proofErr w:type="spellEnd"/>
+          <w:r>
+            <w:rPr>
+              <w:rFonts w:ascii="Times New Roman" w:hAnsi="Times New Roman"/>
+              <w:color w:val="1F4E79"/>
+              <w:lang w:val="en-US"/>
+            </w:rPr>
+            <w:t xml:space="preserve"> </w:t>
+          </w:r>
+          <w:proofErr w:type="spellStart"/>
+          <w:r>
+            <w:rPr>
+              <w:rFonts w:ascii="Times New Roman" w:hAnsi="Times New Roman"/>
+              <w:color w:val="1F4E79"/>
+              <w:lang w:val="en-US"/>
+            </w:rPr>
+            <w:t>Lạc</w:t>
+          </w:r>
+          <w:proofErr w:type="spellEnd"/>
+          <w:r>
+            <w:rPr>
+              <w:rFonts w:ascii="Times New Roman" w:hAnsi="Times New Roman"/>
+              <w:color w:val="1F4E79"/>
+              <w:lang w:val="en-US"/>
+            </w:rPr>
+            <w:t xml:space="preserve"> Hồng</w:t>
           </w:r>
           <w:r>
             <w:rPr>
               <w:rFonts w:ascii="Times New Roman" w:hAnsi="Times New Roman"/>
-              <w:b/>
               <w:color w:val="1F4E79"/>
-              <w:szCs w:val="16"/>
               <w:lang w:val="en-US"/>
             </w:rPr>
-            <w:t xml:space="preserve"> 2186</w:t>
+            <w:t>,</w:t>
           </w:r>
-        </w:p>
-        <w:p>
-          <w:pPr>
-            <w:pStyle w:val="Footer"/>
-            <w:jc w:val="right"/>
-            <w:rPr>
-              <w:rFonts w:ascii="Times New Roman" w:hAnsi="Times New Roman"/>
-              <w:b/>
-              <w:color w:val="1F4E79"/>
-              <w:szCs w:val="16"/>
-              <w:lang w:val="en-US"/>
-            </w:rPr>
-          </w:pPr>
           <w:r>
             <w:rPr>
               <w:rFonts w:ascii="Times New Roman" w:hAnsi="Times New Roman"/>
-              <w:b/>
-              <w:noProof/>
               <w:color w:val="1F4E79"/>
-              <w:sz w:val="16"/>
-              <w:szCs w:val="16"/>
               <w:lang w:val="en-US"/>
             </w:rPr>
-            <w:t>{journal_meta}</w:t>
+            <w:t xml:space="preserve"> </w:t>
+          </w:r>
+          <w:r>
+            <w:rPr>
+              <w:rFonts w:ascii="Times New Roman" w:hAnsi="Times New Roman"/>
+              <w:color w:val="1F4E79"/>
+              <w:lang w:val="en-US"/>
+            </w:rPr>
+            <w:t>{</w:t>
+          </w:r>
+          <w:proofErr w:type="spellStart"/>
+          <w:r>
+            <w:rPr>
+              <w:rFonts w:ascii="Times New Roman" w:hAnsi="Times New Roman"/>
+              <w:color w:val="1F4E79"/>
+              <w:lang w:val="en-US"/>
+            </w:rPr>
+            <w:t>journal_meta</w:t>
+          </w:r>
+          <w:proofErr w:type="spellEnd"/>
+          <w:r>
+            <w:rPr>
+              <w:rFonts w:ascii="Times New Roman" w:hAnsi="Times New Roman"/>
+              <w:color w:val="1F4E79"/>
+              <w:lang w:val="en-US"/>
+            </w:rPr>
+            <w:t>}</w:t>
           </w:r>
         </w:p>
       </w:tc>
@@ -4810,7 +4904,7 @@
         <w:i/>
         <w:lang w:val="en-US"/>
       </w:rPr>
-      <w:t>{title}</w:t>
+      <w:t>Author name</w:t>
     </w:r>
   </w:p>
 </w:hdr>

</xml_diff>

<commit_message>
thêm chỗ địa chỉ, upd paste toàn nội dung
</commit_message>
<xml_diff>
--- a/public/assets/magazine/template.docx
+++ b/public/assets/magazine/template.docx
@@ -35,15 +35,7 @@
           <w:rFonts w:ascii="Times" w:hAnsi="Times"/>
           <w:sz w:val="24"/>
         </w:rPr>
-        <w:t>{</w:t>
-      </w:r>
-      <w:proofErr w:type="spellStart"/>
-      <w:r>
-        <w:rPr>
-          <w:rFonts w:ascii="Times" w:hAnsi="Times"/>
-          <w:sz w:val="24"/>
-        </w:rPr>
-        <w:t>authors</w:t>
+        <w:t>{authors</w:t>
       </w:r>
       <w:r>
         <w:rPr>
@@ -52,7 +44,6 @@
         </w:rPr>
         <w:t>_vi</w:t>
       </w:r>
-      <w:proofErr w:type="spellEnd"/>
       <w:r>
         <w:rPr>
           <w:rFonts w:ascii="Times" w:hAnsi="Times"/>
@@ -72,7 +63,7 @@
           <w:iCs/>
           <w:sz w:val="20"/>
           <w:szCs w:val="20"/>
-          <w:lang w:val="vi-VN"/>
+          <w:lang w:val="en-US"/>
         </w:rPr>
       </w:pPr>
       <w:r>
@@ -82,9 +73,9 @@
           <w:iCs/>
           <w:sz w:val="20"/>
           <w:szCs w:val="20"/>
-          <w:lang w:val="vi-VN"/>
+          <w:lang w:val="en-US"/>
         </w:rPr>
-        <w:t>Trường Đại học Lạc Hồng, Số 10 Huỳnh Văn Nghệ, phường Bửu Long, Biên Hòa, Đồng Nai, Vietnam</w:t>
+        <w:t>{address_vi}</w:t>
       </w:r>
     </w:p>
     <w:p>
@@ -697,7 +688,6 @@
         </w:rPr>
         <w:t>{</w:t>
       </w:r>
-      <w:proofErr w:type="spellStart"/>
       <w:r>
         <w:rPr>
           <w:b/>
@@ -708,7 +698,6 @@
         </w:rPr>
         <w:t>title_en</w:t>
       </w:r>
-      <w:proofErr w:type="spellEnd"/>
       <w:r>
         <w:rPr>
           <w:b/>
@@ -735,30 +724,7 @@
           <w:rFonts w:ascii="Times" w:hAnsi="Times"/>
           <w:sz w:val="24"/>
         </w:rPr>
-        <w:t>{</w:t>
-      </w:r>
-      <w:proofErr w:type="spellStart"/>
-      <w:r>
-        <w:rPr>
-          <w:rFonts w:ascii="Times" w:hAnsi="Times"/>
-          <w:sz w:val="24"/>
-        </w:rPr>
-        <w:t>authors_</w:t>
-      </w:r>
-      <w:r>
-        <w:rPr>
-          <w:rFonts w:ascii="Times" w:hAnsi="Times"/>
-          <w:sz w:val="24"/>
-        </w:rPr>
-        <w:t>en</w:t>
-      </w:r>
-      <w:proofErr w:type="spellEnd"/>
-      <w:r>
-        <w:rPr>
-          <w:rFonts w:ascii="Times" w:hAnsi="Times"/>
-          <w:sz w:val="24"/>
-        </w:rPr>
-        <w:t>}</w:t>
+        <w:t>{authors_en}</w:t>
       </w:r>
     </w:p>
     <w:p>
@@ -783,7 +749,7 @@
           <w:sz w:val="20"/>
           <w:szCs w:val="20"/>
         </w:rPr>
-        <w:t>Lac Hong University, No. 10 Huynh Van Nghe Str, Buu Long Ward, Bien Hoa, Dong Nai, Vietnam</w:t>
+        <w:t>{address_en}</w:t>
       </w:r>
     </w:p>
     <w:p>
@@ -981,27 +947,7 @@
                 <w:szCs w:val="20"/>
                 <w:lang w:val="en-US"/>
               </w:rPr>
-              <w:t>{</w:t>
-            </w:r>
-            <w:proofErr w:type="spellStart"/>
-            <w:r>
-              <w:rPr>
-                <w:rFonts w:ascii="Times New Roman" w:hAnsi="Times New Roman"/>
-                <w:sz w:val="20"/>
-                <w:szCs w:val="20"/>
-                <w:lang w:val="en-US"/>
-              </w:rPr>
-              <w:t>abstract_en</w:t>
-            </w:r>
-            <w:proofErr w:type="spellEnd"/>
-            <w:r>
-              <w:rPr>
-                <w:rFonts w:ascii="Times New Roman" w:hAnsi="Times New Roman"/>
-                <w:sz w:val="20"/>
-                <w:szCs w:val="20"/>
-                <w:lang w:val="en-US"/>
-              </w:rPr>
-              <w:t>}</w:t>
+              <w:t>{abstract_en}</w:t>
             </w:r>
           </w:p>
         </w:tc>
@@ -1287,17 +1233,7 @@
                 <w:szCs w:val="20"/>
                 <w:lang w:val="en-US"/>
               </w:rPr>
-              <w:t>{</w:t>
-            </w:r>
-            <w:proofErr w:type="spellStart"/>
-            <w:r>
-              <w:rPr>
-                <w:rFonts w:ascii="Times New Roman" w:hAnsi="Times New Roman"/>
-                <w:sz w:val="20"/>
-                <w:szCs w:val="20"/>
-                <w:lang w:val="en-US"/>
-              </w:rPr>
-              <w:t>keywords</w:t>
+              <w:t>{keywords</w:t>
             </w:r>
             <w:r>
               <w:rPr>
@@ -1308,7 +1244,6 @@
               </w:rPr>
               <w:t>_en</w:t>
             </w:r>
-            <w:proofErr w:type="spellEnd"/>
             <w:r>
               <w:rPr>
                 <w:rFonts w:ascii="Times New Roman" w:hAnsi="Times New Roman"/>
@@ -1393,29 +1328,7 @@
                 <w:szCs w:val="20"/>
                 <w:lang w:val="en-US"/>
               </w:rPr>
-              <w:t xml:space="preserve"> {</w:t>
-            </w:r>
-            <w:proofErr w:type="spellStart"/>
-            <w:r>
-              <w:rPr>
-                <w:rFonts w:ascii="Times New Roman" w:eastAsia="Times New Roman" w:hAnsi="Times New Roman"/>
-                <w:color w:val="000000"/>
-                <w:sz w:val="20"/>
-                <w:szCs w:val="20"/>
-                <w:lang w:val="en-US"/>
-              </w:rPr>
-              <w:t>doi</w:t>
-            </w:r>
-            <w:proofErr w:type="spellEnd"/>
-            <w:r>
-              <w:rPr>
-                <w:rFonts w:ascii="Times New Roman" w:eastAsia="Times New Roman" w:hAnsi="Times New Roman"/>
-                <w:color w:val="000000"/>
-                <w:sz w:val="20"/>
-                <w:szCs w:val="20"/>
-                <w:lang w:val="en-US"/>
-              </w:rPr>
-              <w:t>}</w:t>
+              <w:t xml:space="preserve"> {doi}</w:t>
             </w:r>
           </w:p>
           <w:p>
@@ -1456,15 +1369,12 @@
               <w:t xml:space="preserve"> </w:t>
             </w:r>
             <w:r>
-              <w:t>{</w:t>
-            </w:r>
-            <w:proofErr w:type="spellStart"/>
-            <w:r>
-              <w:t>link_doi</w:t>
-            </w:r>
-            <w:proofErr w:type="spellEnd"/>
-            <w:r>
-              <w:t>}</w:t>
+              <w:rPr>
+                <w:rFonts w:ascii="Times New Roman" w:hAnsi="Times New Roman"/>
+                <w:sz w:val="20"/>
+                <w:szCs w:val="20"/>
+              </w:rPr>
+              <w:t>{link_doi}</w:t>
             </w:r>
           </w:p>
         </w:tc>
@@ -4756,77 +4666,13 @@
             </w:rPr>
             <w:br/>
           </w:r>
-          <w:proofErr w:type="spellStart"/>
           <w:r>
             <w:rPr>
               <w:rFonts w:ascii="Times New Roman" w:hAnsi="Times New Roman"/>
               <w:color w:val="1F4E79"/>
               <w:lang w:val="en-US"/>
             </w:rPr>
-            <w:t>Tạp</w:t>
-          </w:r>
-          <w:proofErr w:type="spellEnd"/>
-          <w:r>
-            <w:rPr>
-              <w:rFonts w:ascii="Times New Roman" w:hAnsi="Times New Roman"/>
-              <w:color w:val="1F4E79"/>
-              <w:lang w:val="en-US"/>
-            </w:rPr>
-            <w:t xml:space="preserve"> </w:t>
-          </w:r>
-          <w:proofErr w:type="spellStart"/>
-          <w:r>
-            <w:rPr>
-              <w:rFonts w:ascii="Times New Roman" w:hAnsi="Times New Roman"/>
-              <w:color w:val="1F4E79"/>
-              <w:lang w:val="en-US"/>
-            </w:rPr>
-            <w:t>chí</w:t>
-          </w:r>
-          <w:proofErr w:type="spellEnd"/>
-          <w:r>
-            <w:rPr>
-              <w:rFonts w:ascii="Times New Roman" w:hAnsi="Times New Roman"/>
-              <w:color w:val="1F4E79"/>
-              <w:lang w:val="en-US"/>
-            </w:rPr>
-            <w:t xml:space="preserve"> Khoa </w:t>
-          </w:r>
-          <w:proofErr w:type="spellStart"/>
-          <w:r>
-            <w:rPr>
-              <w:rFonts w:ascii="Times New Roman" w:hAnsi="Times New Roman"/>
-              <w:color w:val="1F4E79"/>
-              <w:lang w:val="en-US"/>
-            </w:rPr>
-            <w:t>học</w:t>
-          </w:r>
-          <w:proofErr w:type="spellEnd"/>
-          <w:r>
-            <w:rPr>
-              <w:rFonts w:ascii="Times New Roman" w:hAnsi="Times New Roman"/>
-              <w:color w:val="1F4E79"/>
-              <w:lang w:val="en-US"/>
-            </w:rPr>
-            <w:t xml:space="preserve"> </w:t>
-          </w:r>
-          <w:proofErr w:type="spellStart"/>
-          <w:r>
-            <w:rPr>
-              <w:rFonts w:ascii="Times New Roman" w:hAnsi="Times New Roman"/>
-              <w:color w:val="1F4E79"/>
-              <w:lang w:val="en-US"/>
-            </w:rPr>
-            <w:t>Lạc</w:t>
-          </w:r>
-          <w:proofErr w:type="spellEnd"/>
-          <w:r>
-            <w:rPr>
-              <w:rFonts w:ascii="Times New Roman" w:hAnsi="Times New Roman"/>
-              <w:color w:val="1F4E79"/>
-              <w:lang w:val="en-US"/>
-            </w:rPr>
-            <w:t xml:space="preserve"> Hồng</w:t>
+            <w:t>Tạp chí Khoa học Lạc Hồng</w:t>
           </w:r>
           <w:r>
             <w:rPr>
@@ -4850,25 +4696,7 @@
               <w:color w:val="1F4E79"/>
               <w:lang w:val="en-US"/>
             </w:rPr>
-            <w:t>{</w:t>
-          </w:r>
-          <w:proofErr w:type="spellStart"/>
-          <w:r>
-            <w:rPr>
-              <w:rFonts w:ascii="Times New Roman" w:hAnsi="Times New Roman"/>
-              <w:color w:val="1F4E79"/>
-              <w:lang w:val="en-US"/>
-            </w:rPr>
-            <w:t>journal_meta</w:t>
-          </w:r>
-          <w:proofErr w:type="spellEnd"/>
-          <w:r>
-            <w:rPr>
-              <w:rFonts w:ascii="Times New Roman" w:hAnsi="Times New Roman"/>
-              <w:color w:val="1F4E79"/>
-              <w:lang w:val="en-US"/>
-            </w:rPr>
-            <w:t>}</w:t>
+            <w:t>{journal_meta}</w:t>
           </w:r>
         </w:p>
       </w:tc>

</xml_diff>

<commit_message>
link DOI mặc định, sửa tí cơ chế nhập keywords, ngày tiếng anh kiểu MON dd, yyyy
</commit_message>
<xml_diff>
--- a/public/assets/magazine/template.docx
+++ b/public/assets/magazine/template.docx
@@ -300,6 +300,7 @@
           <w:p>
             <w:pPr>
               <w:spacing w:before="60" w:after="60"/>
+              <w:ind w:hanging="99"/>
               <w:rPr>
                 <w:rFonts w:ascii="Times New Roman" w:hAnsi="Times New Roman"/>
                 <w:sz w:val="20"/>
@@ -307,6 +308,33 @@
                 <w:lang w:val="vi-VN"/>
               </w:rPr>
             </w:pPr>
+            <w:r>
+              <w:rPr>
+                <w:rFonts w:ascii="Times New Roman" w:hAnsi="Times New Roman"/>
+                <w:sz w:val="20"/>
+                <w:szCs w:val="20"/>
+                <w:lang w:val="vi-VN"/>
+              </w:rPr>
+              <w:t>{</w:t>
+            </w:r>
+            <w:r>
+              <w:rPr>
+                <w:rFonts w:ascii="Times New Roman" w:hAnsi="Times New Roman"/>
+                <w:sz w:val="20"/>
+                <w:szCs w:val="20"/>
+                <w:lang w:val="en-US"/>
+              </w:rPr>
+              <w:t>date_</w:t>
+            </w:r>
+            <w:r>
+              <w:rPr>
+                <w:rFonts w:ascii="Times New Roman" w:hAnsi="Times New Roman"/>
+                <w:sz w:val="20"/>
+                <w:szCs w:val="20"/>
+                <w:lang w:val="vi-VN"/>
+              </w:rPr>
+              <w:t>received_vi}</w:t>
+            </w:r>
           </w:p>
         </w:tc>
         <w:tc>
@@ -365,6 +393,7 @@
           <w:p>
             <w:pPr>
               <w:spacing w:before="60" w:after="60"/>
+              <w:ind w:hanging="99"/>
               <w:rPr>
                 <w:rFonts w:ascii="Times New Roman" w:hAnsi="Times New Roman"/>
                 <w:sz w:val="20"/>
@@ -372,6 +401,15 @@
                 <w:lang w:val="vi-VN"/>
               </w:rPr>
             </w:pPr>
+            <w:r>
+              <w:rPr>
+                <w:rFonts w:ascii="Times New Roman" w:hAnsi="Times New Roman"/>
+                <w:sz w:val="20"/>
+                <w:szCs w:val="20"/>
+                <w:lang w:val="vi-VN"/>
+              </w:rPr>
+              <w:t>{date_revised_vi}</w:t>
+            </w:r>
           </w:p>
         </w:tc>
         <w:tc>
@@ -435,6 +473,7 @@
           <w:p>
             <w:pPr>
               <w:spacing w:before="60" w:after="60"/>
+              <w:ind w:hanging="99"/>
               <w:rPr>
                 <w:rFonts w:ascii="Times New Roman" w:hAnsi="Times New Roman"/>
                 <w:sz w:val="20"/>
@@ -442,6 +481,15 @@
                 <w:lang w:val="vi-VN"/>
               </w:rPr>
             </w:pPr>
+            <w:r>
+              <w:rPr>
+                <w:rFonts w:ascii="Times New Roman" w:hAnsi="Times New Roman"/>
+                <w:sz w:val="20"/>
+                <w:szCs w:val="20"/>
+                <w:lang w:val="vi-VN"/>
+              </w:rPr>
+              <w:t>{date_accepted_vi}</w:t>
+            </w:r>
           </w:p>
         </w:tc>
         <w:tc>
@@ -506,6 +554,7 @@
           <w:p>
             <w:pPr>
               <w:spacing w:before="60" w:after="60"/>
+              <w:ind w:hanging="99"/>
               <w:rPr>
                 <w:rFonts w:ascii="Times New Roman" w:hAnsi="Times New Roman"/>
                 <w:sz w:val="20"/>
@@ -513,6 +562,15 @@
                 <w:lang w:val="vi-VN"/>
               </w:rPr>
             </w:pPr>
+            <w:r>
+              <w:rPr>
+                <w:rFonts w:ascii="Times New Roman" w:hAnsi="Times New Roman"/>
+                <w:sz w:val="20"/>
+                <w:szCs w:val="20"/>
+                <w:lang w:val="vi-VN"/>
+              </w:rPr>
+              <w:t>{date_published_vi}</w:t>
+            </w:r>
           </w:p>
         </w:tc>
         <w:tc>
@@ -921,6 +979,14 @@
                 <w:szCs w:val="18"/>
               </w:rPr>
             </w:pPr>
+            <w:r>
+              <w:rPr>
+                <w:rFonts w:ascii="Times New Roman" w:hAnsi="Times New Roman"/>
+                <w:sz w:val="18"/>
+                <w:szCs w:val="18"/>
+              </w:rPr>
+              <w:t>{date_received_en}</w:t>
+            </w:r>
           </w:p>
         </w:tc>
         <w:tc>
@@ -992,6 +1058,13 @@
                 <w:szCs w:val="18"/>
               </w:rPr>
             </w:pPr>
+            <w:r>
+              <w:rPr>
+                <w:sz w:val="18"/>
+                <w:szCs w:val="18"/>
+              </w:rPr>
+              <w:t>{date_revised_en}</w:t>
+            </w:r>
           </w:p>
         </w:tc>
         <w:tc>
@@ -1057,6 +1130,13 @@
                 <w:szCs w:val="18"/>
               </w:rPr>
             </w:pPr>
+            <w:r>
+              <w:rPr>
+                <w:sz w:val="18"/>
+                <w:szCs w:val="18"/>
+              </w:rPr>
+              <w:t>{date_accepted_en}</w:t>
+            </w:r>
           </w:p>
         </w:tc>
         <w:tc>
@@ -1122,6 +1202,13 @@
                 <w:szCs w:val="18"/>
               </w:rPr>
             </w:pPr>
+            <w:r>
+              <w:rPr>
+                <w:sz w:val="18"/>
+                <w:szCs w:val="18"/>
+              </w:rPr>
+              <w:t>{date_published_en}</w:t>
+            </w:r>
           </w:p>
         </w:tc>
         <w:tc>

</xml_diff>

<commit_message>
sửa size ngày anh template
</commit_message>
<xml_diff>
--- a/public/assets/magazine/template.docx
+++ b/public/assets/magazine/template.docx
@@ -35,7 +35,15 @@
           <w:rFonts w:ascii="Times" w:hAnsi="Times"/>
           <w:sz w:val="24"/>
         </w:rPr>
-        <w:t>{authors</w:t>
+        <w:t>{</w:t>
+      </w:r>
+      <w:proofErr w:type="spellStart"/>
+      <w:r>
+        <w:rPr>
+          <w:rFonts w:ascii="Times" w:hAnsi="Times"/>
+          <w:sz w:val="24"/>
+        </w:rPr>
+        <w:t>authors</w:t>
       </w:r>
       <w:r>
         <w:rPr>
@@ -44,6 +52,7 @@
         </w:rPr>
         <w:t>_vi</w:t>
       </w:r>
+      <w:proofErr w:type="spellEnd"/>
       <w:r>
         <w:rPr>
           <w:rFonts w:ascii="Times" w:hAnsi="Times"/>
@@ -75,7 +84,31 @@
           <w:szCs w:val="20"/>
           <w:lang w:val="en-US"/>
         </w:rPr>
-        <w:t>{address_vi}</w:t>
+        <w:t>{</w:t>
+      </w:r>
+      <w:proofErr w:type="spellStart"/>
+      <w:r>
+        <w:rPr>
+          <w:rFonts w:ascii="Times New Roman" w:hAnsi="Times New Roman"/>
+          <w:i/>
+          <w:iCs/>
+          <w:sz w:val="20"/>
+          <w:szCs w:val="20"/>
+          <w:lang w:val="en-US"/>
+        </w:rPr>
+        <w:t>address_vi</w:t>
+      </w:r>
+      <w:proofErr w:type="spellEnd"/>
+      <w:r>
+        <w:rPr>
+          <w:rFonts w:ascii="Times New Roman" w:hAnsi="Times New Roman"/>
+          <w:i/>
+          <w:iCs/>
+          <w:sz w:val="20"/>
+          <w:szCs w:val="20"/>
+          <w:lang w:val="en-US"/>
+        </w:rPr>
+        <w:t>}</w:t>
       </w:r>
     </w:p>
     <w:p>
@@ -746,6 +779,7 @@
         </w:rPr>
         <w:t>{</w:t>
       </w:r>
+      <w:proofErr w:type="spellStart"/>
       <w:r>
         <w:rPr>
           <w:b/>
@@ -756,6 +790,7 @@
         </w:rPr>
         <w:t>title_en</w:t>
       </w:r>
+      <w:proofErr w:type="spellEnd"/>
       <w:r>
         <w:rPr>
           <w:b/>
@@ -782,7 +817,23 @@
           <w:rFonts w:ascii="Times" w:hAnsi="Times"/>
           <w:sz w:val="24"/>
         </w:rPr>
-        <w:t>{authors_en}</w:t>
+        <w:t>{</w:t>
+      </w:r>
+      <w:proofErr w:type="spellStart"/>
+      <w:r>
+        <w:rPr>
+          <w:rFonts w:ascii="Times" w:hAnsi="Times"/>
+          <w:sz w:val="24"/>
+        </w:rPr>
+        <w:t>authors_en</w:t>
+      </w:r>
+      <w:proofErr w:type="spellEnd"/>
+      <w:r>
+        <w:rPr>
+          <w:rFonts w:ascii="Times" w:hAnsi="Times"/>
+          <w:sz w:val="24"/>
+        </w:rPr>
+        <w:t>}</w:t>
       </w:r>
     </w:p>
     <w:p>
@@ -807,7 +858,29 @@
           <w:sz w:val="20"/>
           <w:szCs w:val="20"/>
         </w:rPr>
-        <w:t>{address_en}</w:t>
+        <w:t>{</w:t>
+      </w:r>
+      <w:proofErr w:type="spellStart"/>
+      <w:r>
+        <w:rPr>
+          <w:rFonts w:ascii="Times New Roman" w:hAnsi="Times New Roman"/>
+          <w:i/>
+          <w:iCs/>
+          <w:sz w:val="20"/>
+          <w:szCs w:val="20"/>
+        </w:rPr>
+        <w:t>address_en</w:t>
+      </w:r>
+      <w:proofErr w:type="spellEnd"/>
+      <w:r>
+        <w:rPr>
+          <w:rFonts w:ascii="Times New Roman" w:hAnsi="Times New Roman"/>
+          <w:i/>
+          <w:iCs/>
+          <w:sz w:val="20"/>
+          <w:szCs w:val="20"/>
+        </w:rPr>
+        <w:t>}</w:t>
       </w:r>
     </w:p>
     <w:p>
@@ -949,15 +1022,15 @@
               <w:spacing w:before="60" w:after="60"/>
               <w:rPr>
                 <w:rFonts w:ascii="Times New Roman" w:hAnsi="Times New Roman"/>
-                <w:sz w:val="18"/>
-                <w:szCs w:val="18"/>
+                <w:sz w:val="20"/>
+                <w:szCs w:val="20"/>
               </w:rPr>
             </w:pPr>
             <w:r>
               <w:rPr>
                 <w:rFonts w:ascii="Times New Roman" w:hAnsi="Times New Roman"/>
-                <w:sz w:val="18"/>
-                <w:szCs w:val="18"/>
+                <w:sz w:val="20"/>
+                <w:szCs w:val="20"/>
               </w:rPr>
               <w:t xml:space="preserve">Received: </w:t>
             </w:r>
@@ -975,17 +1048,35 @@
               <w:spacing w:before="60" w:after="60"/>
               <w:rPr>
                 <w:rFonts w:ascii="Times New Roman" w:hAnsi="Times New Roman"/>
-                <w:sz w:val="18"/>
-                <w:szCs w:val="18"/>
+                <w:sz w:val="20"/>
+                <w:szCs w:val="20"/>
               </w:rPr>
             </w:pPr>
             <w:r>
               <w:rPr>
                 <w:rFonts w:ascii="Times New Roman" w:hAnsi="Times New Roman"/>
-                <w:sz w:val="18"/>
-                <w:szCs w:val="18"/>
+                <w:sz w:val="20"/>
+                <w:szCs w:val="20"/>
               </w:rPr>
-              <w:t>{date_received_en}</w:t>
+              <w:t>{</w:t>
+            </w:r>
+            <w:proofErr w:type="spellStart"/>
+            <w:r>
+              <w:rPr>
+                <w:rFonts w:ascii="Times New Roman" w:hAnsi="Times New Roman"/>
+                <w:sz w:val="20"/>
+                <w:szCs w:val="20"/>
+              </w:rPr>
+              <w:t>date_received_en</w:t>
+            </w:r>
+            <w:proofErr w:type="spellEnd"/>
+            <w:r>
+              <w:rPr>
+                <w:rFonts w:ascii="Times New Roman" w:hAnsi="Times New Roman"/>
+                <w:sz w:val="20"/>
+                <w:szCs w:val="20"/>
+              </w:rPr>
+              <w:t>}</w:t>
             </w:r>
           </w:p>
         </w:tc>
@@ -1013,7 +1104,27 @@
                 <w:szCs w:val="20"/>
                 <w:lang w:val="en-US"/>
               </w:rPr>
-              <w:t>{abstract_en}</w:t>
+              <w:t>{</w:t>
+            </w:r>
+            <w:proofErr w:type="spellStart"/>
+            <w:r>
+              <w:rPr>
+                <w:rFonts w:ascii="Times New Roman" w:hAnsi="Times New Roman"/>
+                <w:sz w:val="20"/>
+                <w:szCs w:val="20"/>
+                <w:lang w:val="en-US"/>
+              </w:rPr>
+              <w:t>abstract_en</w:t>
+            </w:r>
+            <w:proofErr w:type="spellEnd"/>
+            <w:r>
+              <w:rPr>
+                <w:rFonts w:ascii="Times New Roman" w:hAnsi="Times New Roman"/>
+                <w:sz w:val="20"/>
+                <w:szCs w:val="20"/>
+                <w:lang w:val="en-US"/>
+              </w:rPr>
+              <w:t>}</w:t>
             </w:r>
           </w:p>
         </w:tc>
@@ -1032,15 +1143,15 @@
               <w:spacing w:before="60" w:after="60"/>
               <w:rPr>
                 <w:rFonts w:ascii="Times New Roman" w:hAnsi="Times New Roman"/>
-                <w:sz w:val="18"/>
-                <w:szCs w:val="18"/>
+                <w:sz w:val="20"/>
+                <w:szCs w:val="20"/>
               </w:rPr>
             </w:pPr>
             <w:r>
               <w:rPr>
                 <w:rFonts w:ascii="Times New Roman" w:hAnsi="Times New Roman"/>
-                <w:sz w:val="18"/>
-                <w:szCs w:val="18"/>
+                <w:sz w:val="20"/>
+                <w:szCs w:val="20"/>
               </w:rPr>
               <w:t xml:space="preserve">Revised: </w:t>
             </w:r>
@@ -1054,16 +1165,32 @@
             <w:pPr>
               <w:spacing w:before="60" w:after="60"/>
               <w:rPr>
-                <w:sz w:val="18"/>
-                <w:szCs w:val="18"/>
+                <w:sz w:val="20"/>
+                <w:szCs w:val="20"/>
               </w:rPr>
             </w:pPr>
             <w:r>
               <w:rPr>
-                <w:sz w:val="18"/>
-                <w:szCs w:val="18"/>
+                <w:sz w:val="20"/>
+                <w:szCs w:val="20"/>
               </w:rPr>
-              <w:t>{date_revised_en}</w:t>
+              <w:t>{</w:t>
+            </w:r>
+            <w:proofErr w:type="spellStart"/>
+            <w:r>
+              <w:rPr>
+                <w:sz w:val="20"/>
+                <w:szCs w:val="20"/>
+              </w:rPr>
+              <w:t>date_revised_en</w:t>
+            </w:r>
+            <w:proofErr w:type="spellEnd"/>
+            <w:r>
+              <w:rPr>
+                <w:sz w:val="20"/>
+                <w:szCs w:val="20"/>
+              </w:rPr>
+              <w:t>}</w:t>
             </w:r>
           </w:p>
         </w:tc>
@@ -1104,15 +1231,15 @@
               <w:spacing w:before="60" w:after="60"/>
               <w:rPr>
                 <w:rFonts w:ascii="Times New Roman" w:hAnsi="Times New Roman"/>
-                <w:sz w:val="18"/>
-                <w:szCs w:val="18"/>
+                <w:sz w:val="20"/>
+                <w:szCs w:val="20"/>
               </w:rPr>
             </w:pPr>
             <w:r>
               <w:rPr>
                 <w:rFonts w:ascii="Times New Roman" w:hAnsi="Times New Roman"/>
-                <w:sz w:val="18"/>
-                <w:szCs w:val="18"/>
+                <w:sz w:val="20"/>
+                <w:szCs w:val="20"/>
               </w:rPr>
               <w:t>Accepted:</w:t>
             </w:r>
@@ -1126,16 +1253,32 @@
             <w:pPr>
               <w:spacing w:before="60" w:after="60"/>
               <w:rPr>
-                <w:sz w:val="18"/>
-                <w:szCs w:val="18"/>
+                <w:sz w:val="20"/>
+                <w:szCs w:val="20"/>
               </w:rPr>
             </w:pPr>
             <w:r>
               <w:rPr>
-                <w:sz w:val="18"/>
-                <w:szCs w:val="18"/>
+                <w:sz w:val="20"/>
+                <w:szCs w:val="20"/>
               </w:rPr>
-              <w:t>{date_accepted_en}</w:t>
+              <w:t>{</w:t>
+            </w:r>
+            <w:proofErr w:type="spellStart"/>
+            <w:r>
+              <w:rPr>
+                <w:sz w:val="20"/>
+                <w:szCs w:val="20"/>
+              </w:rPr>
+              <w:t>date_accepted_en</w:t>
+            </w:r>
+            <w:proofErr w:type="spellEnd"/>
+            <w:r>
+              <w:rPr>
+                <w:sz w:val="20"/>
+                <w:szCs w:val="20"/>
+              </w:rPr>
+              <w:t>}</w:t>
             </w:r>
           </w:p>
         </w:tc>
@@ -1176,15 +1319,15 @@
               <w:spacing w:before="60" w:after="60"/>
               <w:rPr>
                 <w:rFonts w:ascii="Times New Roman" w:hAnsi="Times New Roman"/>
-                <w:sz w:val="18"/>
-                <w:szCs w:val="18"/>
+                <w:sz w:val="20"/>
+                <w:szCs w:val="20"/>
               </w:rPr>
             </w:pPr>
             <w:r>
               <w:rPr>
                 <w:rFonts w:ascii="Times New Roman" w:hAnsi="Times New Roman"/>
-                <w:sz w:val="18"/>
-                <w:szCs w:val="18"/>
+                <w:sz w:val="20"/>
+                <w:szCs w:val="20"/>
               </w:rPr>
               <w:t xml:space="preserve">Published: </w:t>
             </w:r>
@@ -1198,16 +1341,32 @@
             <w:pPr>
               <w:spacing w:before="60" w:after="60"/>
               <w:rPr>
-                <w:sz w:val="18"/>
-                <w:szCs w:val="18"/>
+                <w:sz w:val="20"/>
+                <w:szCs w:val="20"/>
               </w:rPr>
             </w:pPr>
             <w:r>
               <w:rPr>
-                <w:sz w:val="18"/>
-                <w:szCs w:val="18"/>
+                <w:sz w:val="20"/>
+                <w:szCs w:val="20"/>
               </w:rPr>
-              <w:t>{date_published_en}</w:t>
+              <w:t>{</w:t>
+            </w:r>
+            <w:proofErr w:type="spellStart"/>
+            <w:r>
+              <w:rPr>
+                <w:sz w:val="20"/>
+                <w:szCs w:val="20"/>
+              </w:rPr>
+              <w:t>date_published_en</w:t>
+            </w:r>
+            <w:proofErr w:type="spellEnd"/>
+            <w:r>
+              <w:rPr>
+                <w:sz w:val="20"/>
+                <w:szCs w:val="20"/>
+              </w:rPr>
+              <w:t>}</w:t>
             </w:r>
           </w:p>
         </w:tc>
@@ -1320,7 +1479,17 @@
                 <w:szCs w:val="20"/>
                 <w:lang w:val="en-US"/>
               </w:rPr>
-              <w:t>{keywords</w:t>
+              <w:t>{</w:t>
+            </w:r>
+            <w:proofErr w:type="spellStart"/>
+            <w:r>
+              <w:rPr>
+                <w:rFonts w:ascii="Times New Roman" w:hAnsi="Times New Roman"/>
+                <w:sz w:val="20"/>
+                <w:szCs w:val="20"/>
+                <w:lang w:val="en-US"/>
+              </w:rPr>
+              <w:t>keywords</w:t>
             </w:r>
             <w:r>
               <w:rPr>
@@ -1331,6 +1500,7 @@
               </w:rPr>
               <w:t>_en</w:t>
             </w:r>
+            <w:proofErr w:type="spellEnd"/>
             <w:r>
               <w:rPr>
                 <w:rFonts w:ascii="Times New Roman" w:hAnsi="Times New Roman"/>
@@ -1415,7 +1585,29 @@
                 <w:szCs w:val="20"/>
                 <w:lang w:val="en-US"/>
               </w:rPr>
-              <w:t xml:space="preserve"> {doi}</w:t>
+              <w:t xml:space="preserve"> {</w:t>
+            </w:r>
+            <w:proofErr w:type="spellStart"/>
+            <w:r>
+              <w:rPr>
+                <w:rFonts w:ascii="Times New Roman" w:eastAsia="Times New Roman" w:hAnsi="Times New Roman"/>
+                <w:color w:val="000000"/>
+                <w:sz w:val="20"/>
+                <w:szCs w:val="20"/>
+                <w:lang w:val="en-US"/>
+              </w:rPr>
+              <w:t>doi</w:t>
+            </w:r>
+            <w:proofErr w:type="spellEnd"/>
+            <w:r>
+              <w:rPr>
+                <w:rFonts w:ascii="Times New Roman" w:eastAsia="Times New Roman" w:hAnsi="Times New Roman"/>
+                <w:color w:val="000000"/>
+                <w:sz w:val="20"/>
+                <w:szCs w:val="20"/>
+                <w:lang w:val="en-US"/>
+              </w:rPr>
+              <w:t>}</w:t>
             </w:r>
           </w:p>
           <w:p>
@@ -1461,7 +1653,25 @@
                 <w:sz w:val="20"/>
                 <w:szCs w:val="20"/>
               </w:rPr>
-              <w:t>{link_doi}</w:t>
+              <w:t>{</w:t>
+            </w:r>
+            <w:proofErr w:type="spellStart"/>
+            <w:r>
+              <w:rPr>
+                <w:rFonts w:ascii="Times New Roman" w:hAnsi="Times New Roman"/>
+                <w:sz w:val="20"/>
+                <w:szCs w:val="20"/>
+              </w:rPr>
+              <w:t>link_doi</w:t>
+            </w:r>
+            <w:proofErr w:type="spellEnd"/>
+            <w:r>
+              <w:rPr>
+                <w:rFonts w:ascii="Times New Roman" w:hAnsi="Times New Roman"/>
+                <w:sz w:val="20"/>
+                <w:szCs w:val="20"/>
+              </w:rPr>
+              <w:t>}</w:t>
             </w:r>
           </w:p>
         </w:tc>
@@ -4753,13 +4963,77 @@
             </w:rPr>
             <w:br/>
           </w:r>
+          <w:proofErr w:type="spellStart"/>
           <w:r>
             <w:rPr>
               <w:rFonts w:ascii="Times New Roman" w:hAnsi="Times New Roman"/>
               <w:color w:val="1F4E79"/>
               <w:lang w:val="en-US"/>
             </w:rPr>
-            <w:t>Tạp chí Khoa học Lạc Hồng</w:t>
+            <w:t>Tạp</w:t>
+          </w:r>
+          <w:proofErr w:type="spellEnd"/>
+          <w:r>
+            <w:rPr>
+              <w:rFonts w:ascii="Times New Roman" w:hAnsi="Times New Roman"/>
+              <w:color w:val="1F4E79"/>
+              <w:lang w:val="en-US"/>
+            </w:rPr>
+            <w:t xml:space="preserve"> </w:t>
+          </w:r>
+          <w:proofErr w:type="spellStart"/>
+          <w:r>
+            <w:rPr>
+              <w:rFonts w:ascii="Times New Roman" w:hAnsi="Times New Roman"/>
+              <w:color w:val="1F4E79"/>
+              <w:lang w:val="en-US"/>
+            </w:rPr>
+            <w:t>chí</w:t>
+          </w:r>
+          <w:proofErr w:type="spellEnd"/>
+          <w:r>
+            <w:rPr>
+              <w:rFonts w:ascii="Times New Roman" w:hAnsi="Times New Roman"/>
+              <w:color w:val="1F4E79"/>
+              <w:lang w:val="en-US"/>
+            </w:rPr>
+            <w:t xml:space="preserve"> Khoa </w:t>
+          </w:r>
+          <w:proofErr w:type="spellStart"/>
+          <w:r>
+            <w:rPr>
+              <w:rFonts w:ascii="Times New Roman" w:hAnsi="Times New Roman"/>
+              <w:color w:val="1F4E79"/>
+              <w:lang w:val="en-US"/>
+            </w:rPr>
+            <w:t>học</w:t>
+          </w:r>
+          <w:proofErr w:type="spellEnd"/>
+          <w:r>
+            <w:rPr>
+              <w:rFonts w:ascii="Times New Roman" w:hAnsi="Times New Roman"/>
+              <w:color w:val="1F4E79"/>
+              <w:lang w:val="en-US"/>
+            </w:rPr>
+            <w:t xml:space="preserve"> </w:t>
+          </w:r>
+          <w:proofErr w:type="spellStart"/>
+          <w:r>
+            <w:rPr>
+              <w:rFonts w:ascii="Times New Roman" w:hAnsi="Times New Roman"/>
+              <w:color w:val="1F4E79"/>
+              <w:lang w:val="en-US"/>
+            </w:rPr>
+            <w:t>Lạc</w:t>
+          </w:r>
+          <w:proofErr w:type="spellEnd"/>
+          <w:r>
+            <w:rPr>
+              <w:rFonts w:ascii="Times New Roman" w:hAnsi="Times New Roman"/>
+              <w:color w:val="1F4E79"/>
+              <w:lang w:val="en-US"/>
+            </w:rPr>
+            <w:t xml:space="preserve"> Hồng</w:t>
           </w:r>
           <w:r>
             <w:rPr>
@@ -4783,7 +5057,25 @@
               <w:color w:val="1F4E79"/>
               <w:lang w:val="en-US"/>
             </w:rPr>
-            <w:t>{journal_meta}</w:t>
+            <w:t>{</w:t>
+          </w:r>
+          <w:proofErr w:type="spellStart"/>
+          <w:r>
+            <w:rPr>
+              <w:rFonts w:ascii="Times New Roman" w:hAnsi="Times New Roman"/>
+              <w:color w:val="1F4E79"/>
+              <w:lang w:val="en-US"/>
+            </w:rPr>
+            <w:t>journal_meta</w:t>
+          </w:r>
+          <w:proofErr w:type="spellEnd"/>
+          <w:r>
+            <w:rPr>
+              <w:rFonts w:ascii="Times New Roman" w:hAnsi="Times New Roman"/>
+              <w:color w:val="1F4E79"/>
+              <w:lang w:val="en-US"/>
+            </w:rPr>
+            <w:t>}</w:t>
           </w:r>
         </w:p>
       </w:tc>

</xml_diff>